<commit_message>
code for getting env file into powershell develop
</commit_message>
<xml_diff>
--- a/02-documentation/documentation.docx
+++ b/02-documentation/documentation.docx
@@ -1546,7 +1546,6 @@
       </w:r>
     </w:p>
     <w:p/>
-    <w:p/>
     <w:p>
       <w:pPr>
         <w:numPr>
@@ -1569,6 +1568,8 @@
         <w:t>Screenshots der Ausführung</w:t>
       </w:r>
     </w:p>
+    <w:p/>
+    <w:p/>
     <w:p/>
     <w:p>
       <w:pPr>
@@ -5258,13 +5259,13 @@
   <w:rsids>
     <w:rsidRoot w:val="00876153"/>
     <w:rsid w:val="00232454"/>
-    <w:rsid w:val="002F518C"/>
     <w:rsid w:val="00532091"/>
     <w:rsid w:val="00876153"/>
     <w:rsid w:val="00BC5649"/>
     <w:rsid w:val="00BD40C7"/>
     <w:rsid w:val="00CA4F5A"/>
     <w:rsid w:val="00D507A1"/>
+    <w:rsid w:val="00E30BD7"/>
   </w:rsids>
   <m:mathPr>
     <m:mathFont m:val="Cambria Math"/>

</xml_diff>